<commit_message>
modificaciones tipos de empresas
</commit_message>
<xml_diff>
--- a/tmp/documents/guia_tramitadores/guia_flujo_empresa_tramitadores_inso.docx
+++ b/tmp/documents/guia_tramitadores/guia_flujo_empresa_tramitadores_inso.docx
@@ -338,6 +338,7 @@
           </w:tcPr>
           <w:p>
             <w:pPr>
+              <w:keepNext/>
               <w:spacing w:before="0" w:after="0" w:line="264" w:lineRule="auto"/>
             </w:pPr>
             <w:r>
@@ -374,6 +375,7 @@
           </w:tcPr>
           <w:p>
             <w:pPr>
+              <w:keepNext/>
               <w:spacing w:before="0" w:after="0" w:line="264" w:lineRule="auto"/>
             </w:pPr>
             <w:r>
@@ -1387,6 +1389,7 @@
           </w:tcPr>
           <w:p>
             <w:pPr>
+              <w:keepNext/>
               <w:spacing w:before="0" w:after="0" w:line="264" w:lineRule="auto"/>
             </w:pPr>
             <w:r>
@@ -1423,6 +1426,7 @@
           </w:tcPr>
           <w:p>
             <w:pPr>
+              <w:keepNext/>
               <w:spacing w:before="0" w:after="0" w:line="264" w:lineRule="auto"/>
             </w:pPr>
             <w:r>
@@ -1800,11 +1804,6 @@
       </w:r>
     </w:p>
     <w:p>
-      <w:r>
-        <w:br w:type="page"/>
-      </w:r>
-    </w:p>
-    <w:p>
       <w:pPr>
         <w:pStyle w:val="Heading1"/>
         <w:keepNext/>
@@ -2126,6 +2125,7 @@
           </w:tcPr>
           <w:p>
             <w:pPr>
+              <w:keepNext/>
               <w:spacing w:before="0" w:after="0" w:line="264" w:lineRule="auto"/>
             </w:pPr>
             <w:r>
@@ -2162,6 +2162,7 @@
           </w:tcPr>
           <w:p>
             <w:pPr>
+              <w:keepNext/>
               <w:spacing w:before="0" w:after="0" w:line="264" w:lineRule="auto"/>
             </w:pPr>
             <w:r>
@@ -3059,6 +3060,7 @@
           </w:tcPr>
           <w:p>
             <w:pPr>
+              <w:keepNext/>
               <w:spacing w:before="0" w:after="0" w:line="264" w:lineRule="auto"/>
             </w:pPr>
             <w:r>
@@ -3095,6 +3097,7 @@
           </w:tcPr>
           <w:p>
             <w:pPr>
+              <w:keepNext/>
               <w:spacing w:before="0" w:after="0" w:line="264" w:lineRule="auto"/>
             </w:pPr>
             <w:r>
@@ -3733,11 +3736,6 @@
       </w:pPr>
     </w:p>
     <w:p>
-      <w:r>
-        <w:br w:type="page"/>
-      </w:r>
-    </w:p>
-    <w:p>
       <w:pPr>
         <w:pStyle w:val="Heading1"/>
         <w:keepNext/>
@@ -3788,6 +3786,7 @@
           </w:tcPr>
           <w:p>
             <w:pPr>
+              <w:keepNext/>
               <w:spacing w:before="0" w:after="0" w:line="264" w:lineRule="auto"/>
             </w:pPr>
             <w:r>
@@ -3824,6 +3823,7 @@
           </w:tcPr>
           <w:p>
             <w:pPr>
+              <w:keepNext/>
               <w:spacing w:before="0" w:after="0" w:line="264" w:lineRule="auto"/>
             </w:pPr>
             <w:r>
@@ -3860,6 +3860,7 @@
           </w:tcPr>
           <w:p>
             <w:pPr>
+              <w:keepNext/>
               <w:spacing w:before="0" w:after="0" w:line="264" w:lineRule="auto"/>
             </w:pPr>
             <w:r>
@@ -5133,6 +5134,7 @@
     </w:p>
     <w:p>
       <w:pPr>
+        <w:keepNext/>
         <w:widowControl/>
         <w:spacing w:before="0" w:after="120" w:line="300" w:lineRule="auto"/>
       </w:pPr>
@@ -5189,6 +5191,7 @@
           </w:tcPr>
           <w:p>
             <w:pPr>
+              <w:keepNext/>
               <w:spacing w:before="0" w:after="0" w:line="264" w:lineRule="auto"/>
             </w:pPr>
             <w:r>
@@ -5225,6 +5228,7 @@
           </w:tcPr>
           <w:p>
             <w:pPr>
+              <w:keepNext/>
               <w:spacing w:before="0" w:after="0" w:line="264" w:lineRule="auto"/>
             </w:pPr>
             <w:r>
@@ -5261,6 +5265,7 @@
           </w:tcPr>
           <w:p>
             <w:pPr>
+              <w:keepNext/>
               <w:spacing w:before="0" w:after="0" w:line="264" w:lineRule="auto"/>
             </w:pPr>
             <w:r>
@@ -5893,6 +5898,7 @@
           </w:tcPr>
           <w:p>
             <w:pPr>
+              <w:keepNext/>
               <w:spacing w:before="0" w:after="0" w:line="264" w:lineRule="auto"/>
             </w:pPr>
             <w:r>
@@ -5929,6 +5935,7 @@
           </w:tcPr>
           <w:p>
             <w:pPr>
+              <w:keepNext/>
               <w:spacing w:before="0" w:after="0" w:line="264" w:lineRule="auto"/>
             </w:pPr>
             <w:r>
@@ -7035,6 +7042,237 @@
       </w:rPr>
     </w:lvl>
   </w:abstractNum>
+  <w:abstractNum w:abstractNumId="9">
+    <w:nsid w:val="00000009"/>
+    <w:multiLevelType w:val="singleLevel"/>
+    <w:lvl w:ilvl="0">
+      <w:start w:val="1"/>
+      <w:numFmt w:val="bullet"/>
+      <w:lvlText w:val="•"/>
+      <w:suff w:val="tab"/>
+      <w:lvlJc w:val="left"/>
+      <w:pPr>
+        <w:tabs>
+          <w:tab w:val="num" w:pos="540"/>
+        </w:tabs>
+        <w:ind w:left="540" w:hanging="270"/>
+      </w:pPr>
+      <w:rPr>
+        <w:rFonts w:ascii="Calibri" w:hAnsi="Calibri"/>
+        <w:color w:val="0F766E"/>
+      </w:rPr>
+    </w:lvl>
+  </w:abstractNum>
+  <w:abstractNum w:abstractNumId="10">
+    <w:nsid w:val="0000000A"/>
+    <w:multiLevelType w:val="singleLevel"/>
+    <w:lvl w:ilvl="0">
+      <w:start w:val="1"/>
+      <w:numFmt w:val="decimal"/>
+      <w:lvlText w:val="%1."/>
+      <w:suff w:val="tab"/>
+      <w:lvlJc w:val="left"/>
+      <w:pPr>
+        <w:tabs>
+          <w:tab w:val="num" w:pos="540"/>
+        </w:tabs>
+        <w:ind w:left="540" w:hanging="270"/>
+      </w:pPr>
+      <w:rPr>
+        <w:rFonts w:ascii="Calibri" w:hAnsi="Calibri"/>
+        <w:color w:val="2E74B5"/>
+      </w:rPr>
+    </w:lvl>
+  </w:abstractNum>
+  <w:abstractNum w:abstractNumId="11">
+    <w:nsid w:val="0000000B"/>
+    <w:multiLevelType w:val="singleLevel"/>
+    <w:lvl w:ilvl="0">
+      <w:start w:val="1"/>
+      <w:numFmt w:val="decimal"/>
+      <w:lvlText w:val="%1."/>
+      <w:suff w:val="tab"/>
+      <w:lvlJc w:val="left"/>
+      <w:pPr>
+        <w:tabs>
+          <w:tab w:val="num" w:pos="540"/>
+        </w:tabs>
+        <w:ind w:left="540" w:hanging="270"/>
+      </w:pPr>
+      <w:rPr>
+        <w:rFonts w:ascii="Calibri" w:hAnsi="Calibri"/>
+        <w:color w:val="2E74B5"/>
+      </w:rPr>
+    </w:lvl>
+  </w:abstractNum>
+  <w:abstractNum w:abstractNumId="12">
+    <w:nsid w:val="0000000C"/>
+    <w:multiLevelType w:val="singleLevel"/>
+    <w:lvl w:ilvl="0">
+      <w:start w:val="1"/>
+      <w:numFmt w:val="bullet"/>
+      <w:lvlText w:val="•"/>
+      <w:suff w:val="tab"/>
+      <w:lvlJc w:val="left"/>
+      <w:pPr>
+        <w:tabs>
+          <w:tab w:val="num" w:pos="540"/>
+        </w:tabs>
+        <w:ind w:left="540" w:hanging="270"/>
+      </w:pPr>
+      <w:rPr>
+        <w:rFonts w:ascii="Calibri" w:hAnsi="Calibri"/>
+        <w:color w:val="0F766E"/>
+      </w:rPr>
+    </w:lvl>
+  </w:abstractNum>
+  <w:abstractNum w:abstractNumId="13">
+    <w:nsid w:val="0000000D"/>
+    <w:multiLevelType w:val="singleLevel"/>
+    <w:lvl w:ilvl="0">
+      <w:start w:val="1"/>
+      <w:numFmt w:val="decimal"/>
+      <w:lvlText w:val="%1."/>
+      <w:suff w:val="tab"/>
+      <w:lvlJc w:val="left"/>
+      <w:pPr>
+        <w:tabs>
+          <w:tab w:val="num" w:pos="540"/>
+        </w:tabs>
+        <w:ind w:left="540" w:hanging="270"/>
+      </w:pPr>
+      <w:rPr>
+        <w:rFonts w:ascii="Calibri" w:hAnsi="Calibri"/>
+        <w:color w:val="2E74B5"/>
+      </w:rPr>
+    </w:lvl>
+  </w:abstractNum>
+  <w:abstractNum w:abstractNumId="14">
+    <w:nsid w:val="0000000E"/>
+    <w:multiLevelType w:val="singleLevel"/>
+    <w:lvl w:ilvl="0">
+      <w:start w:val="1"/>
+      <w:numFmt w:val="decimal"/>
+      <w:lvlText w:val="%1."/>
+      <w:suff w:val="tab"/>
+      <w:lvlJc w:val="left"/>
+      <w:pPr>
+        <w:tabs>
+          <w:tab w:val="num" w:pos="540"/>
+        </w:tabs>
+        <w:ind w:left="540" w:hanging="270"/>
+      </w:pPr>
+      <w:rPr>
+        <w:rFonts w:ascii="Calibri" w:hAnsi="Calibri"/>
+        <w:color w:val="2E74B5"/>
+      </w:rPr>
+    </w:lvl>
+  </w:abstractNum>
+  <w:abstractNum w:abstractNumId="15">
+    <w:nsid w:val="0000000F"/>
+    <w:multiLevelType w:val="singleLevel"/>
+    <w:lvl w:ilvl="0">
+      <w:start w:val="1"/>
+      <w:numFmt w:val="bullet"/>
+      <w:lvlText w:val="•"/>
+      <w:suff w:val="tab"/>
+      <w:lvlJc w:val="left"/>
+      <w:pPr>
+        <w:tabs>
+          <w:tab w:val="num" w:pos="540"/>
+        </w:tabs>
+        <w:ind w:left="540" w:hanging="270"/>
+      </w:pPr>
+      <w:rPr>
+        <w:rFonts w:ascii="Calibri" w:hAnsi="Calibri"/>
+        <w:color w:val="0F766E"/>
+      </w:rPr>
+    </w:lvl>
+  </w:abstractNum>
+  <w:abstractNum w:abstractNumId="16">
+    <w:nsid w:val="00000010"/>
+    <w:multiLevelType w:val="singleLevel"/>
+    <w:lvl w:ilvl="0">
+      <w:start w:val="1"/>
+      <w:numFmt w:val="decimal"/>
+      <w:lvlText w:val="%1."/>
+      <w:suff w:val="tab"/>
+      <w:lvlJc w:val="left"/>
+      <w:pPr>
+        <w:tabs>
+          <w:tab w:val="num" w:pos="540"/>
+        </w:tabs>
+        <w:ind w:left="540" w:hanging="270"/>
+      </w:pPr>
+      <w:rPr>
+        <w:rFonts w:ascii="Calibri" w:hAnsi="Calibri"/>
+        <w:color w:val="2E74B5"/>
+      </w:rPr>
+    </w:lvl>
+  </w:abstractNum>
+  <w:abstractNum w:abstractNumId="17">
+    <w:nsid w:val="00000011"/>
+    <w:multiLevelType w:val="singleLevel"/>
+    <w:lvl w:ilvl="0">
+      <w:start w:val="1"/>
+      <w:numFmt w:val="decimal"/>
+      <w:lvlText w:val="%1."/>
+      <w:suff w:val="tab"/>
+      <w:lvlJc w:val="left"/>
+      <w:pPr>
+        <w:tabs>
+          <w:tab w:val="num" w:pos="540"/>
+        </w:tabs>
+        <w:ind w:left="540" w:hanging="270"/>
+      </w:pPr>
+      <w:rPr>
+        <w:rFonts w:ascii="Calibri" w:hAnsi="Calibri"/>
+        <w:color w:val="2E74B5"/>
+      </w:rPr>
+    </w:lvl>
+  </w:abstractNum>
+  <w:abstractNum w:abstractNumId="18">
+    <w:nsid w:val="00000012"/>
+    <w:multiLevelType w:val="singleLevel"/>
+    <w:lvl w:ilvl="0">
+      <w:start w:val="1"/>
+      <w:numFmt w:val="decimal"/>
+      <w:lvlText w:val="%1."/>
+      <w:suff w:val="tab"/>
+      <w:lvlJc w:val="left"/>
+      <w:pPr>
+        <w:tabs>
+          <w:tab w:val="num" w:pos="540"/>
+        </w:tabs>
+        <w:ind w:left="540" w:hanging="270"/>
+      </w:pPr>
+      <w:rPr>
+        <w:rFonts w:ascii="Calibri" w:hAnsi="Calibri"/>
+        <w:color w:val="2E74B5"/>
+      </w:rPr>
+    </w:lvl>
+  </w:abstractNum>
+  <w:abstractNum w:abstractNumId="19">
+    <w:nsid w:val="00000013"/>
+    <w:multiLevelType w:val="singleLevel"/>
+    <w:lvl w:ilvl="0">
+      <w:start w:val="1"/>
+      <w:numFmt w:val="bullet"/>
+      <w:lvlText w:val="•"/>
+      <w:suff w:val="tab"/>
+      <w:lvlJc w:val="left"/>
+      <w:pPr>
+        <w:tabs>
+          <w:tab w:val="num" w:pos="540"/>
+        </w:tabs>
+        <w:ind w:left="540" w:hanging="270"/>
+      </w:pPr>
+      <w:rPr>
+        <w:rFonts w:ascii="Calibri" w:hAnsi="Calibri"/>
+        <w:color w:val="0F766E"/>
+      </w:rPr>
+    </w:lvl>
+  </w:abstractNum>
   <w:num w:numId="1">
     <w:abstractNumId w:val="8"/>
   </w:num>
@@ -7062,245 +7300,36 @@
   <w:num w:numId="9">
     <w:abstractNumId w:val="0"/>
   </w:num>
-  <w:abstractNum w:abstractNumId="9">
-    <w:nsid w:val="00000009"/>
-    <w:multiLevelType w:val="singleLevel"/>
-    <w:lvl w:ilvl="0">
-      <w:start w:val="1"/>
-      <w:numFmt w:val="bullet"/>
-      <w:lvlText w:val="•"/>
-      <w:lvlJc w:val="left"/>
-      <w:pPr>
-        <w:tabs>
-          <w:tab w:val="num" w:pos="540"/>
-        </w:tabs>
-        <w:ind w:left="540" w:hanging="270"/>
-      </w:pPr>
-      <w:rPr>
-        <w:color w:val="0F766E"/>
-      </w:rPr>
-    </w:lvl>
-  </w:abstractNum>
   <w:num w:numId="10">
     <w:abstractNumId w:val="9"/>
   </w:num>
-  <w:abstractNum w:abstractNumId="10">
-    <w:nsid w:val="0000000A"/>
-    <w:multiLevelType w:val="singleLevel"/>
-    <w:lvl w:ilvl="0">
-      <w:start w:val="1"/>
-      <w:numFmt w:val="decimal"/>
-      <w:lvlText w:val="%1."/>
-      <w:lvlJc w:val="left"/>
-      <w:pPr>
-        <w:tabs>
-          <w:tab w:val="num" w:pos="540"/>
-        </w:tabs>
-        <w:ind w:left="540" w:hanging="270"/>
-      </w:pPr>
-      <w:rPr>
-        <w:color w:val="2E74B5"/>
-      </w:rPr>
-    </w:lvl>
-  </w:abstractNum>
   <w:num w:numId="11">
     <w:abstractNumId w:val="10"/>
   </w:num>
-  <w:abstractNum w:abstractNumId="11">
-    <w:nsid w:val="0000000B"/>
-    <w:multiLevelType w:val="singleLevel"/>
-    <w:lvl w:ilvl="0">
-      <w:start w:val="1"/>
-      <w:numFmt w:val="decimal"/>
-      <w:lvlText w:val="%1."/>
-      <w:lvlJc w:val="left"/>
-      <w:pPr>
-        <w:tabs>
-          <w:tab w:val="num" w:pos="540"/>
-        </w:tabs>
-        <w:ind w:left="540" w:hanging="270"/>
-      </w:pPr>
-      <w:rPr>
-        <w:color w:val="2E74B5"/>
-      </w:rPr>
-    </w:lvl>
-  </w:abstractNum>
   <w:num w:numId="12">
     <w:abstractNumId w:val="11"/>
   </w:num>
-  <w:abstractNum w:abstractNumId="12">
-    <w:nsid w:val="0000000C"/>
-    <w:multiLevelType w:val="singleLevel"/>
-    <w:lvl w:ilvl="0">
-      <w:start w:val="1"/>
-      <w:numFmt w:val="bullet"/>
-      <w:lvlText w:val="•"/>
-      <w:lvlJc w:val="left"/>
-      <w:pPr>
-        <w:tabs>
-          <w:tab w:val="num" w:pos="540"/>
-        </w:tabs>
-        <w:ind w:left="540" w:hanging="270"/>
-      </w:pPr>
-      <w:rPr>
-        <w:color w:val="0F766E"/>
-      </w:rPr>
-    </w:lvl>
-  </w:abstractNum>
   <w:num w:numId="13">
     <w:abstractNumId w:val="12"/>
   </w:num>
-  <w:abstractNum w:abstractNumId="13">
-    <w:nsid w:val="0000000D"/>
-    <w:multiLevelType w:val="singleLevel"/>
-    <w:lvl w:ilvl="0">
-      <w:start w:val="1"/>
-      <w:numFmt w:val="decimal"/>
-      <w:lvlText w:val="%1."/>
-      <w:lvlJc w:val="left"/>
-      <w:pPr>
-        <w:tabs>
-          <w:tab w:val="num" w:pos="540"/>
-        </w:tabs>
-        <w:ind w:left="540" w:hanging="270"/>
-      </w:pPr>
-      <w:rPr>
-        <w:color w:val="2E74B5"/>
-      </w:rPr>
-    </w:lvl>
-  </w:abstractNum>
   <w:num w:numId="14">
     <w:abstractNumId w:val="13"/>
   </w:num>
-  <w:abstractNum w:abstractNumId="14">
-    <w:nsid w:val="0000000E"/>
-    <w:multiLevelType w:val="singleLevel"/>
-    <w:lvl w:ilvl="0">
-      <w:start w:val="1"/>
-      <w:numFmt w:val="decimal"/>
-      <w:lvlText w:val="%1."/>
-      <w:lvlJc w:val="left"/>
-      <w:pPr>
-        <w:tabs>
-          <w:tab w:val="num" w:pos="540"/>
-        </w:tabs>
-        <w:ind w:left="540" w:hanging="270"/>
-      </w:pPr>
-      <w:rPr>
-        <w:color w:val="2E74B5"/>
-      </w:rPr>
-    </w:lvl>
-  </w:abstractNum>
   <w:num w:numId="15">
     <w:abstractNumId w:val="14"/>
   </w:num>
-  <w:abstractNum w:abstractNumId="15">
-    <w:nsid w:val="0000000F"/>
-    <w:multiLevelType w:val="singleLevel"/>
-    <w:lvl w:ilvl="0">
-      <w:start w:val="1"/>
-      <w:numFmt w:val="bullet"/>
-      <w:lvlText w:val="•"/>
-      <w:lvlJc w:val="left"/>
-      <w:pPr>
-        <w:tabs>
-          <w:tab w:val="num" w:pos="540"/>
-        </w:tabs>
-        <w:ind w:left="540" w:hanging="270"/>
-      </w:pPr>
-      <w:rPr>
-        <w:color w:val="0F766E"/>
-      </w:rPr>
-    </w:lvl>
-  </w:abstractNum>
   <w:num w:numId="16">
     <w:abstractNumId w:val="15"/>
   </w:num>
-  <w:abstractNum w:abstractNumId="16">
-    <w:nsid w:val="00000010"/>
-    <w:multiLevelType w:val="singleLevel"/>
-    <w:lvl w:ilvl="0">
-      <w:start w:val="1"/>
-      <w:numFmt w:val="decimal"/>
-      <w:lvlText w:val="%1."/>
-      <w:lvlJc w:val="left"/>
-      <w:pPr>
-        <w:tabs>
-          <w:tab w:val="num" w:pos="540"/>
-        </w:tabs>
-        <w:ind w:left="540" w:hanging="270"/>
-      </w:pPr>
-      <w:rPr>
-        <w:color w:val="2E74B5"/>
-      </w:rPr>
-    </w:lvl>
-  </w:abstractNum>
   <w:num w:numId="17">
     <w:abstractNumId w:val="16"/>
   </w:num>
-  <w:abstractNum w:abstractNumId="17">
-    <w:nsid w:val="00000011"/>
-    <w:multiLevelType w:val="singleLevel"/>
-    <w:lvl w:ilvl="0">
-      <w:start w:val="1"/>
-      <w:numFmt w:val="decimal"/>
-      <w:lvlText w:val="%1."/>
-      <w:lvlJc w:val="left"/>
-      <w:pPr>
-        <w:tabs>
-          <w:tab w:val="num" w:pos="540"/>
-        </w:tabs>
-        <w:ind w:left="540" w:hanging="270"/>
-      </w:pPr>
-      <w:rPr>
-        <w:color w:val="2E74B5"/>
-      </w:rPr>
-    </w:lvl>
-  </w:abstractNum>
   <w:num w:numId="18">
     <w:abstractNumId w:val="17"/>
   </w:num>
-  <w:abstractNum w:abstractNumId="18">
-    <w:nsid w:val="00000012"/>
-    <w:multiLevelType w:val="singleLevel"/>
-    <w:lvl w:ilvl="0">
-      <w:start w:val="1"/>
-      <w:numFmt w:val="decimal"/>
-      <w:lvlText w:val="%1."/>
-      <w:lvlJc w:val="left"/>
-      <w:pPr>
-        <w:tabs>
-          <w:tab w:val="num" w:pos="540"/>
-        </w:tabs>
-        <w:ind w:left="540" w:hanging="270"/>
-      </w:pPr>
-      <w:rPr>
-        <w:color w:val="2E74B5"/>
-      </w:rPr>
-    </w:lvl>
-  </w:abstractNum>
   <w:num w:numId="19">
     <w:abstractNumId w:val="18"/>
   </w:num>
-  <w:abstractNum w:abstractNumId="19">
-    <w:nsid w:val="00000013"/>
-    <w:multiLevelType w:val="singleLevel"/>
-    <w:lvl w:ilvl="0">
-      <w:start w:val="1"/>
-      <w:numFmt w:val="bullet"/>
-      <w:lvlText w:val="•"/>
-      <w:lvlJc w:val="left"/>
-      <w:pPr>
-        <w:tabs>
-          <w:tab w:val="num" w:pos="540"/>
-        </w:tabs>
-        <w:ind w:left="540" w:hanging="270"/>
-      </w:pPr>
-      <w:rPr>
-        <w:color w:val="0F766E"/>
-      </w:rPr>
-    </w:lvl>
-  </w:abstractNum>
   <w:num w:numId="20">
     <w:abstractNumId w:val="19"/>
   </w:num>

</xml_diff>